<commit_message>
Fix v1 HVIA Task
</commit_message>
<xml_diff>
--- a/HVIA/1-olist_research.docx
+++ b/HVIA/1-olist_research.docx
@@ -636,6 +636,37 @@
           <w:szCs w:val="32"/>
         </w:rPr>
         <w:t>What Can HVIA Offer?</w:t>
+      </w:r>
+    </w:p>
+    <w:p>
+      <w:pPr>
+        <w:spacing w:after="0" w:line="240" w:lineRule="auto"/>
+        <w:ind w:left="360"/>
+        <w:rPr>
+          <w:sz w:val="28"/>
+          <w:szCs w:val="28"/>
+        </w:rPr>
+      </w:pPr>
+      <w:r>
+        <w:rPr>
+          <w:sz w:val="28"/>
+          <w:szCs w:val="28"/>
+        </w:rPr>
+        <w:t xml:space="preserve">Check-&gt; </w:t>
+      </w:r>
+      <w:r>
+        <w:rPr>
+          <w:sz w:val="28"/>
+          <w:szCs w:val="28"/>
+        </w:rPr>
+        <w:t>2-Olist_Business_Review_Accessible</w:t>
+      </w:r>
+      <w:r>
+        <w:rPr>
+          <w:sz w:val="28"/>
+          <w:szCs w:val="28"/>
+        </w:rPr>
+        <w:t>.docx</w:t>
       </w:r>
     </w:p>
     <w:sectPr>

</xml_diff>